<commit_message>
Dokumentáció frissítése: adatmodell, architektúra ábra, piackutatás, taxonómia, AI használati napló, mérési és validációs terv, datvédelmi, jogi, AI és biztonsági kockázati lista
</commit_message>
<xml_diff>
--- a/docs/MVP leírás.docx
+++ b/docs/MVP leírás.docx
@@ -52,10 +52,10 @@
     </w:p>
     <w:p>
       <w:r>
-        <w:t>Az MVP célja annak bemutatása, hogy egy jogi ügy szövege leírásából vagy feltöltött dokumentumából MI segítségével automatikusan meghatározható az ügy típusa és ez alapján megfelelő ügyvéd ajánlható.</w:t>
-      </w:r>
-      <w:r>
-        <w:t xml:space="preserve"> Az MVP-t akkor tekintem késznek, ha egy tesztügy végig tud menni a teljes folyamaton és a mérések minden ügyre eredményt adnak.</w:t>
+        <w:t xml:space="preserve">Az MVP célja annak </w:t>
+      </w:r>
+      <w:r>
+        <w:t>vizsgálata, hogy egy laikus ügyleírásból lehetséges-e ellenőrizhető előzetes ügytípust javasolni. Szükség esetén pontosító kérdést feltenni, majd a felhasználó feltételeihez illő ügyvédprofilokat rangsorolni és megindokolni.</w:t>
       </w:r>
     </w:p>
     <w:p>
@@ -89,6 +89,22 @@
     </w:p>
     <w:p>
       <w:pPr>
+        <w:ind w:left="360"/>
+      </w:pPr>
+      <w:r>
+        <w:t xml:space="preserve">A dokumentumok közötti </w:t>
+      </w:r>
+      <w:proofErr w:type="spellStart"/>
+      <w:r>
+        <w:t>pageflow</w:t>
+      </w:r>
+      <w:proofErr w:type="spellEnd"/>
+      <w:r>
+        <w:t>-vázlatban látható részletesen.</w:t>
+      </w:r>
+    </w:p>
+    <w:p>
+      <w:pPr>
         <w:pStyle w:val="Listaszerbekezds"/>
         <w:numPr>
           <w:ilvl w:val="0"/>
@@ -96,7 +112,7 @@
         </w:numPr>
       </w:pPr>
       <w:r>
-        <w:t>A dokumentumok közötti pageflow-vázlatban látható részletesen.</w:t>
+        <w:t>Az ügyfél regisztrál</w:t>
       </w:r>
     </w:p>
     <w:p>
@@ -108,7 +124,10 @@
         </w:numPr>
       </w:pPr>
       <w:r>
-        <w:t>Az ügyfél regisztrál</w:t>
+        <w:t>S</w:t>
+      </w:r>
+      <w:r>
+        <w:t>zabad szöveges formátumban leírja az ügy adatait</w:t>
       </w:r>
     </w:p>
     <w:p>
@@ -120,10 +139,10 @@
         </w:numPr>
       </w:pPr>
       <w:r>
-        <w:t>S</w:t>
-      </w:r>
-      <w:r>
-        <w:t>zabad szöveges formátumban leírja az ügy adatait</w:t>
+        <w:t>K</w:t>
+      </w:r>
+      <w:r>
+        <w:t>apcsolódó dokumentumokat tölt fel</w:t>
       </w:r>
     </w:p>
     <w:p>
@@ -135,10 +154,7 @@
         </w:numPr>
       </w:pPr>
       <w:r>
-        <w:t>K</w:t>
-      </w:r>
-      <w:r>
-        <w:t>apcsolódó dokumentumokat tölt fel</w:t>
+        <w:t>Strukturált pontosító kérdések megválaszolása</w:t>
       </w:r>
     </w:p>
     <w:p>
@@ -150,7 +166,10 @@
         </w:numPr>
       </w:pPr>
       <w:r>
-        <w:t>Strukturált pontosító kérdések megválaszolása</w:t>
+        <w:t>Á</w:t>
+      </w:r>
+      <w:r>
+        <w:t>tnézi és javítja a maszkolást, ha szükséges, jóváhagyja, ha megfelelő</w:t>
       </w:r>
     </w:p>
     <w:p>
@@ -162,10 +181,7 @@
         </w:numPr>
       </w:pPr>
       <w:r>
-        <w:t>Á</w:t>
-      </w:r>
-      <w:r>
-        <w:t>tnézi és javítja a maszkolást, ha szükséges, jóváhagyja, ha megfelelő</w:t>
+        <w:t>Válaszol pontosító kérdésekre szükség esetén</w:t>
       </w:r>
     </w:p>
     <w:p>
@@ -177,18 +193,6 @@
         </w:numPr>
       </w:pPr>
       <w:r>
-        <w:t>Válaszol pontosító kérdésekre szükség esetén</w:t>
-      </w:r>
-    </w:p>
-    <w:p>
-      <w:pPr>
-        <w:pStyle w:val="Listaszerbekezds"/>
-        <w:numPr>
-          <w:ilvl w:val="0"/>
-          <w:numId w:val="5"/>
-        </w:numPr>
-      </w:pPr>
-      <w:r>
         <w:t>M</w:t>
       </w:r>
       <w:r>
@@ -221,7 +225,31 @@
         <w:t>, kritériumok bekérése strukturált kérdésekkel</w:t>
       </w:r>
       <w:r>
-        <w:t xml:space="preserve"> és dokumentumok feltöltése, ezek biztonságos kezelése, PDF szöveges tartalmának kinyerése, képek, scannelt dokumentumok OCR-ezése, szenzitív adatok maszkolása, maszkolás módosítása az ügyfél jelzése alapján. Fontos adatok kinyerése LLM-mel, </w:t>
+        <w:t xml:space="preserve"> és dokumentumok feltöltése, ezek biztonságos kezelése, PDF szöveges tartalmának kinyerése, képek, </w:t>
+      </w:r>
+      <w:proofErr w:type="spellStart"/>
+      <w:r>
+        <w:t>scannelt</w:t>
+      </w:r>
+      <w:proofErr w:type="spellEnd"/>
+      <w:r>
+        <w:t xml:space="preserve"> dokumentumok OCR-</w:t>
+      </w:r>
+      <w:proofErr w:type="spellStart"/>
+      <w:r>
+        <w:t>ezése</w:t>
+      </w:r>
+      <w:proofErr w:type="spellEnd"/>
+      <w:r>
+        <w:t>, szenzitív adatok maszkolása, maszkolás módosítása az ügyfél jelzése alapján. Fontos adatok kinyerése LLM-</w:t>
+      </w:r>
+      <w:proofErr w:type="spellStart"/>
+      <w:r>
+        <w:t>mel</w:t>
+      </w:r>
+      <w:proofErr w:type="spellEnd"/>
+      <w:r>
+        <w:t xml:space="preserve">, </w:t>
       </w:r>
       <w:r>
         <w:t>ezek validációja, ügytípus meghatározása és validációja, ügyet leíró vektor előállítása, megfelelő ügyvéd megtalálása, AI hívások naplózása</w:t>
@@ -229,6 +257,125 @@
     </w:p>
     <w:p>
       <w:pPr>
+        <w:pStyle w:val="Cmsor2"/>
+      </w:pPr>
+      <w:r>
+        <w:t>SZD I.</w:t>
+      </w:r>
+    </w:p>
+    <w:p>
+      <w:pPr>
+        <w:pStyle w:val="Listaszerbekezds"/>
+        <w:numPr>
+          <w:ilvl w:val="0"/>
+          <w:numId w:val="8"/>
+        </w:numPr>
+      </w:pPr>
+      <w:r>
+        <w:t>magyar nyelv</w:t>
+      </w:r>
+      <w:r>
+        <w:t>ű, szöveges ügyfelvétel</w:t>
+      </w:r>
+    </w:p>
+    <w:p>
+      <w:pPr>
+        <w:pStyle w:val="Listaszerbekezds"/>
+        <w:numPr>
+          <w:ilvl w:val="0"/>
+          <w:numId w:val="8"/>
+        </w:numPr>
+      </w:pPr>
+      <w:r>
+        <w:t>strukturált visszakérdezés</w:t>
+      </w:r>
+    </w:p>
+    <w:p>
+      <w:pPr>
+        <w:pStyle w:val="Listaszerbekezds"/>
+        <w:numPr>
+          <w:ilvl w:val="0"/>
+          <w:numId w:val="8"/>
+        </w:numPr>
+      </w:pPr>
+      <w:r>
+        <w:t>előzetes besorolás</w:t>
+      </w:r>
+    </w:p>
+    <w:p>
+      <w:pPr>
+        <w:pStyle w:val="Listaszerbekezds"/>
+        <w:numPr>
+          <w:ilvl w:val="0"/>
+          <w:numId w:val="8"/>
+        </w:numPr>
+      </w:pPr>
+      <w:r>
+        <w:t>legfeljebb 3 indokolt profilajánlás</w:t>
+      </w:r>
+    </w:p>
+    <w:p>
+      <w:pPr>
+        <w:pStyle w:val="Listaszerbekezds"/>
+        <w:numPr>
+          <w:ilvl w:val="0"/>
+          <w:numId w:val="8"/>
+        </w:numPr>
+      </w:pPr>
+      <w:r>
+        <w:t>saját ügyek megtekintése</w:t>
+      </w:r>
+    </w:p>
+    <w:p>
+      <w:pPr>
+        <w:pStyle w:val="Listaszerbekezds"/>
+        <w:numPr>
+          <w:ilvl w:val="0"/>
+          <w:numId w:val="8"/>
+        </w:numPr>
+      </w:pPr>
+      <w:r>
+        <w:t>egyszerű adminisztráció</w:t>
+      </w:r>
+    </w:p>
+    <w:p>
+      <w:pPr>
+        <w:pStyle w:val="Listaszerbekezds"/>
+        <w:numPr>
+          <w:ilvl w:val="0"/>
+          <w:numId w:val="8"/>
+        </w:numPr>
+      </w:pPr>
+      <w:r>
+        <w:t>hozzáférés-védelem</w:t>
+      </w:r>
+    </w:p>
+    <w:p>
+      <w:pPr>
+        <w:pStyle w:val="Listaszerbekezds"/>
+        <w:numPr>
+          <w:ilvl w:val="0"/>
+          <w:numId w:val="8"/>
+        </w:numPr>
+      </w:pPr>
+      <w:r>
+        <w:t>adatminimalizálás</w:t>
+      </w:r>
+    </w:p>
+    <w:p>
+      <w:pPr>
+        <w:pStyle w:val="Listaszerbekezds"/>
+        <w:numPr>
+          <w:ilvl w:val="0"/>
+          <w:numId w:val="8"/>
+        </w:numPr>
+      </w:pPr>
+      <w:r>
+        <w:t>alap hibakezelés</w:t>
+      </w:r>
+    </w:p>
+    <w:p>
+      <w:pPr>
         <w:pStyle w:val="Cmsor1"/>
         <w:numPr>
           <w:ilvl w:val="0"/>
@@ -241,14 +388,27 @@
     </w:p>
     <w:p>
       <w:r>
-        <w:t>Ügyvédprofilok mockolt adatok,</w:t>
+        <w:t xml:space="preserve">Ügyvédprofilok </w:t>
+      </w:r>
+      <w:proofErr w:type="spellStart"/>
+      <w:r>
+        <w:t>mockolt</w:t>
+      </w:r>
+      <w:proofErr w:type="spellEnd"/>
+      <w:r>
+        <w:t xml:space="preserve"> adatok,</w:t>
       </w:r>
       <w:r>
         <w:t xml:space="preserve"> a mérés szintetikus</w:t>
       </w:r>
       <w:r>
-        <w:t xml:space="preserve"> vagy anonimizált</w:t>
-      </w:r>
+        <w:t xml:space="preserve"> vagy </w:t>
+      </w:r>
+      <w:proofErr w:type="spellStart"/>
+      <w:r>
+        <w:t>anonimizált</w:t>
+      </w:r>
+      <w:proofErr w:type="spellEnd"/>
       <w:r>
         <w:t xml:space="preserve"> tesztügyekkel,</w:t>
       </w:r>
@@ -259,7 +419,11 @@
         <w:t xml:space="preserve">a felhasználók tiltása és figyelmeztetése túl nagy forgalom esetén </w:t>
       </w:r>
       <w:r>
-        <w:t>nem lesz implementálva, ajánlatkérés, időpontegyeztetés és visszajelzések küldése hiányzik. Ezek a funkciók nem részei a vizsgált MI funkciónak.</w:t>
+        <w:t xml:space="preserve">nem lesz </w:t>
+      </w:r>
+      <w:r>
+        <w:lastRenderedPageBreak/>
+        <w:t>implementálva, ajánlatkérés, időpontegyeztetés és visszajelzések küldése hiányzik. Ezek a funkciók nem részei a vizsgált MI funkciónak.</w:t>
       </w:r>
     </w:p>
     <w:p>
@@ -288,8 +452,21 @@
         </w:numPr>
       </w:pPr>
       <w:r>
-        <w:t>Ügytípus-besorolás: macro-F1 és osztályonkénti recall</w:t>
-      </w:r>
+        <w:t xml:space="preserve">Ügytípus-besorolás: macro-F1 és </w:t>
+      </w:r>
+      <w:proofErr w:type="spellStart"/>
+      <w:r>
+        <w:t>osztályonkénti</w:t>
+      </w:r>
+      <w:proofErr w:type="spellEnd"/>
+      <w:r>
+        <w:t xml:space="preserve"> </w:t>
+      </w:r>
+      <w:proofErr w:type="spellStart"/>
+      <w:r>
+        <w:t>recall</w:t>
+      </w:r>
+      <w:proofErr w:type="spellEnd"/>
     </w:p>
     <w:p>
       <w:pPr>
@@ -300,7 +477,23 @@
         </w:numPr>
       </w:pPr>
       <w:r>
-        <w:t>Információkinyerés: mezőszintű precision, recall és F1</w:t>
+        <w:t xml:space="preserve">Információkinyerés: mezőszintű </w:t>
+      </w:r>
+      <w:proofErr w:type="spellStart"/>
+      <w:r>
+        <w:t>precision</w:t>
+      </w:r>
+      <w:proofErr w:type="spellEnd"/>
+      <w:r>
+        <w:t xml:space="preserve">, </w:t>
+      </w:r>
+      <w:proofErr w:type="spellStart"/>
+      <w:r>
+        <w:t>recall</w:t>
+      </w:r>
+      <w:proofErr w:type="spellEnd"/>
+      <w:r>
+        <w:t xml:space="preserve"> és F1</w:t>
       </w:r>
     </w:p>
     <w:p>
@@ -336,8 +529,15 @@
         </w:numPr>
       </w:pPr>
       <w:r>
-        <w:lastRenderedPageBreak/>
-        <w:t>üzemeltetés: válaszidő és költség lekérdezésenként és hibaarány</w:t>
+        <w:t xml:space="preserve">üzemeltetés: válaszidő és költség </w:t>
+      </w:r>
+      <w:proofErr w:type="spellStart"/>
+      <w:r>
+        <w:t>lekérdezésenként</w:t>
+      </w:r>
+      <w:proofErr w:type="spellEnd"/>
+      <w:r>
+        <w:t xml:space="preserve"> és hibaarány</w:t>
       </w:r>
     </w:p>
     <w:p>
@@ -361,7 +561,15 @@
         </w:numPr>
       </w:pPr>
       <w:r>
-        <w:t>három besorolási módszer összehasonlítása: szabályalapú, embeddinges, LLM-alapú)</w:t>
+        <w:t xml:space="preserve">három besorolási módszer összehasonlítása: szabályalapú, </w:t>
+      </w:r>
+      <w:proofErr w:type="spellStart"/>
+      <w:r>
+        <w:t>embeddinges</w:t>
+      </w:r>
+      <w:proofErr w:type="spellEnd"/>
+      <w:r>
+        <w:t>, LLM-alapú)</w:t>
       </w:r>
     </w:p>
     <w:p>
@@ -397,7 +605,15 @@
         </w:numPr>
       </w:pPr>
       <w:r>
-        <w:t>MVP-0: taxonómia, ügyvédprofil-séma, 100-200 tesztügy, szabályalapú besorolási és ajánlási baseline, mérési terv</w:t>
+        <w:t xml:space="preserve">MVP-0: taxonómia, ügyvédprofil-séma, 100-200 tesztügy, szabályalapú besorolási és ajánlási </w:t>
+      </w:r>
+      <w:proofErr w:type="spellStart"/>
+      <w:r>
+        <w:t>baseline</w:t>
+      </w:r>
+      <w:proofErr w:type="spellEnd"/>
+      <w:r>
+        <w:t>, mérési terv</w:t>
       </w:r>
     </w:p>
     <w:p>
@@ -409,8 +625,13 @@
         </w:numPr>
       </w:pPr>
       <w:r>
-        <w:t>MVP-1: szöveges ügybeküldés, strukturált kérdések, pontosító kérdések, besorolás bizalmi értékkel, ajánlás indoklással, egyszerű admin</w:t>
-      </w:r>
+        <w:t xml:space="preserve">MVP-1: szöveges ügybeküldés, strukturált kérdések, pontosító kérdések, besorolás bizalmi értékkel, ajánlás indoklással, egyszerű </w:t>
+      </w:r>
+      <w:proofErr w:type="spellStart"/>
+      <w:r>
+        <w:t>admin</w:t>
+      </w:r>
+      <w:proofErr w:type="spellEnd"/>
     </w:p>
     <w:p>
       <w:pPr>
@@ -450,7 +671,15 @@
     </w:p>
     <w:p>
       <w:r>
-        <w:t>Tisztán modularizált architektúra:</w:t>
+        <w:t xml:space="preserve">Tisztán </w:t>
+      </w:r>
+      <w:proofErr w:type="spellStart"/>
+      <w:r>
+        <w:t>modularizált</w:t>
+      </w:r>
+      <w:proofErr w:type="spellEnd"/>
+      <w:r>
+        <w:t xml:space="preserve"> architektúra:</w:t>
       </w:r>
     </w:p>
     <w:p>
@@ -462,7 +691,7 @@
         </w:numPr>
       </w:pPr>
       <w:r>
-        <w:t>ügyfél intake</w:t>
+        <w:t>ügyfelvétel</w:t>
       </w:r>
     </w:p>
     <w:p>
@@ -486,7 +715,10 @@
         </w:numPr>
       </w:pPr>
       <w:r>
-        <w:t>besoroló és ajánló</w:t>
+        <w:t>besorol</w:t>
+      </w:r>
+      <w:r>
+        <w:t>ás</w:t>
       </w:r>
     </w:p>
     <w:p>
@@ -498,7 +730,10 @@
         </w:numPr>
       </w:pPr>
       <w:r>
-        <w:t>LLM-gateway</w:t>
+        <w:t>ajánl</w:t>
+      </w:r>
+      <w:r>
+        <w:t>ás</w:t>
       </w:r>
     </w:p>
     <w:p>
@@ -510,6 +745,23 @@
         </w:numPr>
       </w:pPr>
       <w:r>
+        <w:t>LLM-</w:t>
+      </w:r>
+      <w:proofErr w:type="spellStart"/>
+      <w:r>
+        <w:t>gateway</w:t>
+      </w:r>
+      <w:proofErr w:type="spellEnd"/>
+    </w:p>
+    <w:p>
+      <w:pPr>
+        <w:pStyle w:val="Listaszerbekezds"/>
+        <w:numPr>
+          <w:ilvl w:val="0"/>
+          <w:numId w:val="7"/>
+        </w:numPr>
+      </w:pPr>
+      <w:r>
         <w:t>audit- és mérési modul</w:t>
       </w:r>
     </w:p>
@@ -527,7 +779,15 @@
     </w:p>
     <w:p>
       <w:r>
-        <w:t>A 6-8 pontosan definált jogterület még kidolgozás alatt áll.</w:t>
+        <w:t xml:space="preserve">A 6-8 pontosan </w:t>
+      </w:r>
+      <w:proofErr w:type="spellStart"/>
+      <w:r>
+        <w:t>definált</w:t>
+      </w:r>
+      <w:proofErr w:type="spellEnd"/>
+      <w:r>
+        <w:t xml:space="preserve"> jogterület még kidolgozás alatt áll.</w:t>
       </w:r>
     </w:p>
     <w:sectPr>
@@ -971,6 +1231,232 @@
     </w:lvl>
   </w:abstractNum>
   <w:abstractNum w:abstractNumId="4" w15:restartNumberingAfterBreak="0">
+    <w:nsid w:val="411218C9"/>
+    <w:multiLevelType w:val="hybridMultilevel"/>
+    <w:tmpl w:val="019AB6BA"/>
+    <w:lvl w:ilvl="0" w:tplc="040E0001">
+      <w:start w:val="1"/>
+      <w:numFmt w:val="bullet"/>
+      <w:lvlText w:val=""/>
+      <w:lvlJc w:val="left"/>
+      <w:pPr>
+        <w:ind w:left="720" w:hanging="360"/>
+      </w:pPr>
+      <w:rPr>
+        <w:rFonts w:ascii="Symbol" w:hAnsi="Symbol" w:hint="default"/>
+      </w:rPr>
+    </w:lvl>
+    <w:lvl w:ilvl="1" w:tplc="040E0003" w:tentative="1">
+      <w:start w:val="1"/>
+      <w:numFmt w:val="bullet"/>
+      <w:lvlText w:val="o"/>
+      <w:lvlJc w:val="left"/>
+      <w:pPr>
+        <w:ind w:left="1440" w:hanging="360"/>
+      </w:pPr>
+      <w:rPr>
+        <w:rFonts w:ascii="Courier New" w:hAnsi="Courier New" w:cs="Courier New" w:hint="default"/>
+      </w:rPr>
+    </w:lvl>
+    <w:lvl w:ilvl="2" w:tplc="040E0005" w:tentative="1">
+      <w:start w:val="1"/>
+      <w:numFmt w:val="bullet"/>
+      <w:lvlText w:val=""/>
+      <w:lvlJc w:val="left"/>
+      <w:pPr>
+        <w:ind w:left="2160" w:hanging="360"/>
+      </w:pPr>
+      <w:rPr>
+        <w:rFonts w:ascii="Wingdings" w:hAnsi="Wingdings" w:hint="default"/>
+      </w:rPr>
+    </w:lvl>
+    <w:lvl w:ilvl="3" w:tplc="040E0001" w:tentative="1">
+      <w:start w:val="1"/>
+      <w:numFmt w:val="bullet"/>
+      <w:lvlText w:val=""/>
+      <w:lvlJc w:val="left"/>
+      <w:pPr>
+        <w:ind w:left="2880" w:hanging="360"/>
+      </w:pPr>
+      <w:rPr>
+        <w:rFonts w:ascii="Symbol" w:hAnsi="Symbol" w:hint="default"/>
+      </w:rPr>
+    </w:lvl>
+    <w:lvl w:ilvl="4" w:tplc="040E0003" w:tentative="1">
+      <w:start w:val="1"/>
+      <w:numFmt w:val="bullet"/>
+      <w:lvlText w:val="o"/>
+      <w:lvlJc w:val="left"/>
+      <w:pPr>
+        <w:ind w:left="3600" w:hanging="360"/>
+      </w:pPr>
+      <w:rPr>
+        <w:rFonts w:ascii="Courier New" w:hAnsi="Courier New" w:cs="Courier New" w:hint="default"/>
+      </w:rPr>
+    </w:lvl>
+    <w:lvl w:ilvl="5" w:tplc="040E0005" w:tentative="1">
+      <w:start w:val="1"/>
+      <w:numFmt w:val="bullet"/>
+      <w:lvlText w:val=""/>
+      <w:lvlJc w:val="left"/>
+      <w:pPr>
+        <w:ind w:left="4320" w:hanging="360"/>
+      </w:pPr>
+      <w:rPr>
+        <w:rFonts w:ascii="Wingdings" w:hAnsi="Wingdings" w:hint="default"/>
+      </w:rPr>
+    </w:lvl>
+    <w:lvl w:ilvl="6" w:tplc="040E0001" w:tentative="1">
+      <w:start w:val="1"/>
+      <w:numFmt w:val="bullet"/>
+      <w:lvlText w:val=""/>
+      <w:lvlJc w:val="left"/>
+      <w:pPr>
+        <w:ind w:left="5040" w:hanging="360"/>
+      </w:pPr>
+      <w:rPr>
+        <w:rFonts w:ascii="Symbol" w:hAnsi="Symbol" w:hint="default"/>
+      </w:rPr>
+    </w:lvl>
+    <w:lvl w:ilvl="7" w:tplc="040E0003" w:tentative="1">
+      <w:start w:val="1"/>
+      <w:numFmt w:val="bullet"/>
+      <w:lvlText w:val="o"/>
+      <w:lvlJc w:val="left"/>
+      <w:pPr>
+        <w:ind w:left="5760" w:hanging="360"/>
+      </w:pPr>
+      <w:rPr>
+        <w:rFonts w:ascii="Courier New" w:hAnsi="Courier New" w:cs="Courier New" w:hint="default"/>
+      </w:rPr>
+    </w:lvl>
+    <w:lvl w:ilvl="8" w:tplc="040E0005" w:tentative="1">
+      <w:start w:val="1"/>
+      <w:numFmt w:val="bullet"/>
+      <w:lvlText w:val=""/>
+      <w:lvlJc w:val="left"/>
+      <w:pPr>
+        <w:ind w:left="6480" w:hanging="360"/>
+      </w:pPr>
+      <w:rPr>
+        <w:rFonts w:ascii="Wingdings" w:hAnsi="Wingdings" w:hint="default"/>
+      </w:rPr>
+    </w:lvl>
+  </w:abstractNum>
+  <w:abstractNum w:abstractNumId="5" w15:restartNumberingAfterBreak="0">
+    <w:nsid w:val="43740E1D"/>
+    <w:multiLevelType w:val="hybridMultilevel"/>
+    <w:tmpl w:val="1CA40646"/>
+    <w:lvl w:ilvl="0" w:tplc="040E0001">
+      <w:start w:val="1"/>
+      <w:numFmt w:val="bullet"/>
+      <w:lvlText w:val=""/>
+      <w:lvlJc w:val="left"/>
+      <w:pPr>
+        <w:ind w:left="720" w:hanging="360"/>
+      </w:pPr>
+      <w:rPr>
+        <w:rFonts w:ascii="Symbol" w:hAnsi="Symbol" w:hint="default"/>
+      </w:rPr>
+    </w:lvl>
+    <w:lvl w:ilvl="1" w:tplc="040E0003" w:tentative="1">
+      <w:start w:val="1"/>
+      <w:numFmt w:val="bullet"/>
+      <w:lvlText w:val="o"/>
+      <w:lvlJc w:val="left"/>
+      <w:pPr>
+        <w:ind w:left="1440" w:hanging="360"/>
+      </w:pPr>
+      <w:rPr>
+        <w:rFonts w:ascii="Courier New" w:hAnsi="Courier New" w:cs="Courier New" w:hint="default"/>
+      </w:rPr>
+    </w:lvl>
+    <w:lvl w:ilvl="2" w:tplc="040E0005" w:tentative="1">
+      <w:start w:val="1"/>
+      <w:numFmt w:val="bullet"/>
+      <w:lvlText w:val=""/>
+      <w:lvlJc w:val="left"/>
+      <w:pPr>
+        <w:ind w:left="2160" w:hanging="360"/>
+      </w:pPr>
+      <w:rPr>
+        <w:rFonts w:ascii="Wingdings" w:hAnsi="Wingdings" w:hint="default"/>
+      </w:rPr>
+    </w:lvl>
+    <w:lvl w:ilvl="3" w:tplc="040E0001" w:tentative="1">
+      <w:start w:val="1"/>
+      <w:numFmt w:val="bullet"/>
+      <w:lvlText w:val=""/>
+      <w:lvlJc w:val="left"/>
+      <w:pPr>
+        <w:ind w:left="2880" w:hanging="360"/>
+      </w:pPr>
+      <w:rPr>
+        <w:rFonts w:ascii="Symbol" w:hAnsi="Symbol" w:hint="default"/>
+      </w:rPr>
+    </w:lvl>
+    <w:lvl w:ilvl="4" w:tplc="040E0003" w:tentative="1">
+      <w:start w:val="1"/>
+      <w:numFmt w:val="bullet"/>
+      <w:lvlText w:val="o"/>
+      <w:lvlJc w:val="left"/>
+      <w:pPr>
+        <w:ind w:left="3600" w:hanging="360"/>
+      </w:pPr>
+      <w:rPr>
+        <w:rFonts w:ascii="Courier New" w:hAnsi="Courier New" w:cs="Courier New" w:hint="default"/>
+      </w:rPr>
+    </w:lvl>
+    <w:lvl w:ilvl="5" w:tplc="040E0005" w:tentative="1">
+      <w:start w:val="1"/>
+      <w:numFmt w:val="bullet"/>
+      <w:lvlText w:val=""/>
+      <w:lvlJc w:val="left"/>
+      <w:pPr>
+        <w:ind w:left="4320" w:hanging="360"/>
+      </w:pPr>
+      <w:rPr>
+        <w:rFonts w:ascii="Wingdings" w:hAnsi="Wingdings" w:hint="default"/>
+      </w:rPr>
+    </w:lvl>
+    <w:lvl w:ilvl="6" w:tplc="040E0001" w:tentative="1">
+      <w:start w:val="1"/>
+      <w:numFmt w:val="bullet"/>
+      <w:lvlText w:val=""/>
+      <w:lvlJc w:val="left"/>
+      <w:pPr>
+        <w:ind w:left="5040" w:hanging="360"/>
+      </w:pPr>
+      <w:rPr>
+        <w:rFonts w:ascii="Symbol" w:hAnsi="Symbol" w:hint="default"/>
+      </w:rPr>
+    </w:lvl>
+    <w:lvl w:ilvl="7" w:tplc="040E0003" w:tentative="1">
+      <w:start w:val="1"/>
+      <w:numFmt w:val="bullet"/>
+      <w:lvlText w:val="o"/>
+      <w:lvlJc w:val="left"/>
+      <w:pPr>
+        <w:ind w:left="5760" w:hanging="360"/>
+      </w:pPr>
+      <w:rPr>
+        <w:rFonts w:ascii="Courier New" w:hAnsi="Courier New" w:cs="Courier New" w:hint="default"/>
+      </w:rPr>
+    </w:lvl>
+    <w:lvl w:ilvl="8" w:tplc="040E0005" w:tentative="1">
+      <w:start w:val="1"/>
+      <w:numFmt w:val="bullet"/>
+      <w:lvlText w:val=""/>
+      <w:lvlJc w:val="left"/>
+      <w:pPr>
+        <w:ind w:left="6480" w:hanging="360"/>
+      </w:pPr>
+      <w:rPr>
+        <w:rFonts w:ascii="Wingdings" w:hAnsi="Wingdings" w:hint="default"/>
+      </w:rPr>
+    </w:lvl>
+  </w:abstractNum>
+  <w:abstractNum w:abstractNumId="6" w15:restartNumberingAfterBreak="0">
     <w:nsid w:val="5570030E"/>
     <w:multiLevelType w:val="hybridMultilevel"/>
     <w:tmpl w:val="99CCBB96"/>
@@ -1083,7 +1569,7 @@
       </w:rPr>
     </w:lvl>
   </w:abstractNum>
-  <w:abstractNum w:abstractNumId="5" w15:restartNumberingAfterBreak="0">
+  <w:abstractNum w:abstractNumId="7" w15:restartNumberingAfterBreak="0">
     <w:nsid w:val="5A0A6FE1"/>
     <w:multiLevelType w:val="hybridMultilevel"/>
     <w:tmpl w:val="D3F62046"/>
@@ -1196,7 +1682,7 @@
       </w:rPr>
     </w:lvl>
   </w:abstractNum>
-  <w:abstractNum w:abstractNumId="6" w15:restartNumberingAfterBreak="0">
+  <w:abstractNum w:abstractNumId="8" w15:restartNumberingAfterBreak="0">
     <w:nsid w:val="7B281296"/>
     <w:multiLevelType w:val="hybridMultilevel"/>
     <w:tmpl w:val="EEB8B6AE"/>
@@ -1285,7 +1771,7 @@
     </w:lvl>
   </w:abstractNum>
   <w:num w:numId="1">
-    <w:abstractNumId w:val="6"/>
+    <w:abstractNumId w:val="8"/>
   </w:num>
   <w:num w:numId="2">
     <w:abstractNumId w:val="1"/>
@@ -1297,13 +1783,19 @@
     <w:abstractNumId w:val="0"/>
   </w:num>
   <w:num w:numId="5">
-    <w:abstractNumId w:val="5"/>
+    <w:abstractNumId w:val="7"/>
   </w:num>
   <w:num w:numId="6">
     <w:abstractNumId w:val="2"/>
   </w:num>
   <w:num w:numId="7">
+    <w:abstractNumId w:val="6"/>
+  </w:num>
+  <w:num w:numId="8">
     <w:abstractNumId w:val="4"/>
+  </w:num>
+  <w:num w:numId="9">
+    <w:abstractNumId w:val="5"/>
   </w:num>
 </w:numbering>
 </file>
@@ -1728,6 +2220,28 @@
       <w:szCs w:val="32"/>
     </w:rPr>
   </w:style>
+  <w:style w:type="paragraph" w:styleId="Cmsor2">
+    <w:name w:val="heading 2"/>
+    <w:basedOn w:val="Norml"/>
+    <w:next w:val="Norml"/>
+    <w:link w:val="Cmsor2Char"/>
+    <w:uiPriority w:val="9"/>
+    <w:unhideWhenUsed/>
+    <w:qFormat/>
+    <w:rsid w:val="000F1B31"/>
+    <w:pPr>
+      <w:keepNext/>
+      <w:keepLines/>
+      <w:spacing w:before="40" w:after="0"/>
+      <w:outlineLvl w:val="1"/>
+    </w:pPr>
+    <w:rPr>
+      <w:rFonts w:asciiTheme="majorHAnsi" w:eastAsiaTheme="majorEastAsia" w:hAnsiTheme="majorHAnsi" w:cstheme="majorBidi"/>
+      <w:color w:val="2F5496" w:themeColor="accent1" w:themeShade="BF"/>
+      <w:sz w:val="26"/>
+      <w:szCs w:val="26"/>
+    </w:rPr>
+  </w:style>
   <w:style w:type="character" w:default="1" w:styleId="Bekezdsalapbettpusa">
     <w:name w:val="Default Paragraph Font"/>
     <w:uiPriority w:val="1"/>
@@ -1854,6 +2368,19 @@
       <w:ind w:left="720"/>
       <w:contextualSpacing/>
     </w:pPr>
+  </w:style>
+  <w:style w:type="character" w:customStyle="1" w:styleId="Cmsor2Char">
+    <w:name w:val="Címsor 2 Char"/>
+    <w:basedOn w:val="Bekezdsalapbettpusa"/>
+    <w:link w:val="Cmsor2"/>
+    <w:uiPriority w:val="9"/>
+    <w:rsid w:val="000F1B31"/>
+    <w:rPr>
+      <w:rFonts w:asciiTheme="majorHAnsi" w:eastAsiaTheme="majorEastAsia" w:hAnsiTheme="majorHAnsi" w:cstheme="majorBidi"/>
+      <w:color w:val="2F5496" w:themeColor="accent1" w:themeShade="BF"/>
+      <w:sz w:val="26"/>
+      <w:szCs w:val="26"/>
+    </w:rPr>
   </w:style>
 </w:styles>
 </file>

</xml_diff>